<commit_message>
new cv w new publication
</commit_message>
<xml_diff>
--- a/YagmurDenizKisa_CV.docx
+++ b/YagmurDenizKisa_CV.docx
@@ -24,19 +24,8 @@
           <w:szCs w:val="32"/>
           <w:lang w:val="en-US"/>
         </w:rPr>
-        <w:t xml:space="preserve">Yağmur Deniz </w:t>
-      </w:r>
-      <w:proofErr w:type="spellStart"/>
-      <w:r>
-        <w:rPr>
-          <w:rFonts w:eastAsia="Times New Roman"/>
-          <w:sz w:val="32"/>
-          <w:szCs w:val="32"/>
-          <w:lang w:val="en-US"/>
-        </w:rPr>
-        <w:t>Kısa</w:t>
-      </w:r>
-      <w:proofErr w:type="spellEnd"/>
+        <w:t>Yağmur Deniz Kısa</w:t>
+      </w:r>
     </w:p>
     <w:p>
       <w:pPr>
@@ -1206,7 +1195,7 @@
           <w:rFonts w:eastAsia="Times New Roman"/>
           <w:sz w:val="28"/>
           <w:szCs w:val="28"/>
-          <w:lang w:val="en-US"/>
+          <w:lang w:val="de-DE"/>
         </w:rPr>
       </w:pPr>
       <w:r>
@@ -1214,7 +1203,7 @@
           <w:rFonts w:eastAsia="Times New Roman"/>
           <w:sz w:val="28"/>
           <w:szCs w:val="28"/>
-          <w:lang w:val="en-US"/>
+          <w:lang w:val="de-DE"/>
         </w:rPr>
         <w:t>P</w:t>
       </w:r>
@@ -1223,7 +1212,7 @@
           <w:rFonts w:eastAsia="Times New Roman"/>
           <w:sz w:val="28"/>
           <w:szCs w:val="28"/>
-          <w:lang w:val="en-US"/>
+          <w:lang w:val="de-DE"/>
         </w:rPr>
         <w:t>ublications</w:t>
       </w:r>
@@ -1232,7 +1221,7 @@
           <w:rFonts w:eastAsia="Times New Roman"/>
           <w:sz w:val="28"/>
           <w:szCs w:val="28"/>
-          <w:lang w:val="en-US"/>
+          <w:lang w:val="de-DE"/>
         </w:rPr>
         <w:t xml:space="preserve"> </w:t>
       </w:r>
@@ -1243,30 +1232,32 @@
         <w:spacing w:beforeLines="40" w:before="96"/>
         <w:ind w:left="709" w:hanging="709"/>
         <w:rPr>
-          <w:sz w:val="20"/>
-          <w:szCs w:val="20"/>
-          <w:lang w:val="en-US"/>
-        </w:rPr>
-      </w:pPr>
-      <w:proofErr w:type="spellStart"/>
-      <w:r>
-        <w:rPr>
           <w:b/>
           <w:bCs/>
           <w:sz w:val="20"/>
           <w:szCs w:val="20"/>
           <w:lang w:val="en-US"/>
         </w:rPr>
-        <w:t>Kısa</w:t>
-      </w:r>
-      <w:proofErr w:type="spellEnd"/>
+      </w:pPr>
+      <w:proofErr w:type="spellStart"/>
       <w:r>
         <w:rPr>
           <w:b/>
           <w:bCs/>
           <w:sz w:val="20"/>
           <w:szCs w:val="20"/>
-          <w:lang w:val="en-US"/>
+          <w:lang w:val="de-DE"/>
+        </w:rPr>
+        <w:t>Kısa</w:t>
+      </w:r>
+      <w:proofErr w:type="spellEnd"/>
+      <w:r>
+        <w:rPr>
+          <w:b/>
+          <w:bCs/>
+          <w:sz w:val="20"/>
+          <w:szCs w:val="20"/>
+          <w:lang w:val="de-DE"/>
         </w:rPr>
         <w:t>, Y. D.</w:t>
       </w:r>
@@ -1274,6 +1265,92 @@
         <w:rPr>
           <w:sz w:val="20"/>
           <w:szCs w:val="20"/>
+          <w:lang w:val="de-DE"/>
+        </w:rPr>
+        <w:t xml:space="preserve">, Stengelin, R., Maurits, L. &amp; Haun, D.B.M. (2026). </w:t>
+      </w:r>
+      <w:r>
+        <w:rPr>
+          <w:sz w:val="20"/>
+          <w:szCs w:val="20"/>
+          <w:lang w:val="en-US"/>
+        </w:rPr>
+        <w:t>Cognitive change without linguistic change: The rise of egocentric frames of reference in the Hai||</w:t>
+      </w:r>
+      <w:proofErr w:type="spellStart"/>
+      <w:r>
+        <w:rPr>
+          <w:sz w:val="20"/>
+          <w:szCs w:val="20"/>
+          <w:lang w:val="en-US"/>
+        </w:rPr>
+        <w:t>om.</w:t>
+      </w:r>
+      <w:proofErr w:type="spellEnd"/>
+      <w:r>
+        <w:rPr>
+          <w:sz w:val="20"/>
+          <w:szCs w:val="20"/>
+          <w:lang w:val="en-US"/>
+        </w:rPr>
+        <w:t> </w:t>
+      </w:r>
+      <w:r>
+        <w:rPr>
+          <w:i/>
+          <w:iCs/>
+          <w:sz w:val="20"/>
+          <w:szCs w:val="20"/>
+          <w:lang w:val="en-US"/>
+        </w:rPr>
+        <w:t>Cognition</w:t>
+      </w:r>
+      <w:r>
+        <w:rPr>
+          <w:sz w:val="20"/>
+          <w:szCs w:val="20"/>
+          <w:lang w:val="en-US"/>
+        </w:rPr>
+        <w:t>, 273, 106522.</w:t>
+      </w:r>
+    </w:p>
+    <w:p>
+      <w:pPr>
+        <w:pStyle w:val="Standard"/>
+        <w:spacing w:beforeLines="40" w:before="96"/>
+        <w:ind w:left="709" w:hanging="709"/>
+        <w:rPr>
+          <w:sz w:val="20"/>
+          <w:szCs w:val="20"/>
+          <w:lang w:val="en-US"/>
+        </w:rPr>
+      </w:pPr>
+      <w:proofErr w:type="spellStart"/>
+      <w:r>
+        <w:rPr>
+          <w:b/>
+          <w:bCs/>
+          <w:sz w:val="20"/>
+          <w:szCs w:val="20"/>
+          <w:lang w:val="en-US"/>
+        </w:rPr>
+        <w:t>Kısa</w:t>
+      </w:r>
+      <w:proofErr w:type="spellEnd"/>
+      <w:r>
+        <w:rPr>
+          <w:b/>
+          <w:bCs/>
+          <w:sz w:val="20"/>
+          <w:szCs w:val="20"/>
+          <w:lang w:val="en-US"/>
+        </w:rPr>
+        <w:t>, Y. D.</w:t>
+      </w:r>
+      <w:r>
+        <w:rPr>
+          <w:sz w:val="20"/>
+          <w:szCs w:val="20"/>
           <w:lang w:val="en-US"/>
         </w:rPr>
         <w:t>, Goldin-Meadow, S., &amp; Casasanto, D. (</w:t>
@@ -1284,7 +1361,7 @@
           <w:szCs w:val="20"/>
           <w:lang w:val="en-US"/>
         </w:rPr>
-        <w:t>in press</w:t>
+        <w:t>2024</w:t>
       </w:r>
       <w:r>
         <w:rPr>
@@ -1749,6 +1826,7 @@
           <w:szCs w:val="28"/>
           <w:lang w:val="en-US"/>
         </w:rPr>
+        <w:lastRenderedPageBreak/>
         <w:t>Invited talks</w:t>
       </w:r>
     </w:p>
@@ -1771,7 +1849,7 @@
           <w:szCs w:val="20"/>
           <w:lang w:val="en-US"/>
         </w:rPr>
-        <w:t>2024</w:t>
+        <w:t>2026</w:t>
       </w:r>
       <w:r>
         <w:rPr>
@@ -1789,7 +1867,25 @@
           <w:szCs w:val="20"/>
           <w:lang w:val="en-US"/>
         </w:rPr>
-        <w:t>“A communicative account of gesturing when speaking is difficult.”</w:t>
+        <w:t>“</w:t>
+      </w:r>
+      <w:r>
+        <w:rPr>
+          <w:rFonts w:eastAsia="Times New Roman"/>
+          <w:sz w:val="20"/>
+          <w:szCs w:val="20"/>
+          <w:lang w:val="en-US"/>
+        </w:rPr>
+        <w:t>The cultural origins of egocentric thinking in children</w:t>
+      </w:r>
+      <w:r>
+        <w:rPr>
+          <w:rFonts w:eastAsia="Times New Roman"/>
+          <w:sz w:val="20"/>
+          <w:szCs w:val="20"/>
+          <w:lang w:val="en-US"/>
+        </w:rPr>
+        <w:t>.”</w:t>
       </w:r>
     </w:p>
     <w:p>
@@ -1811,7 +1907,176 @@
           <w:szCs w:val="20"/>
           <w:lang w:val="en-US"/>
         </w:rPr>
-        <w:lastRenderedPageBreak/>
+        <w:tab/>
+      </w:r>
+      <w:r>
+        <w:rPr>
+          <w:rFonts w:eastAsia="Times New Roman"/>
+          <w:sz w:val="20"/>
+          <w:szCs w:val="20"/>
+          <w:lang w:val="en-US"/>
+        </w:rPr>
+        <w:tab/>
+      </w:r>
+      <w:r>
+        <w:rPr>
+          <w:rFonts w:eastAsia="Times New Roman"/>
+          <w:sz w:val="20"/>
+          <w:szCs w:val="20"/>
+          <w:lang w:val="en-US"/>
+        </w:rPr>
+        <w:tab/>
+      </w:r>
+      <w:r>
+        <w:rPr>
+          <w:rFonts w:eastAsia="Times New Roman"/>
+          <w:sz w:val="20"/>
+          <w:szCs w:val="20"/>
+          <w:lang w:val="en-US"/>
+        </w:rPr>
+        <w:t xml:space="preserve">Language and </w:t>
+      </w:r>
+      <w:r>
+        <w:rPr>
+          <w:rFonts w:eastAsia="Times New Roman"/>
+          <w:sz w:val="20"/>
+          <w:szCs w:val="20"/>
+          <w:lang w:val="en-US"/>
+        </w:rPr>
+        <w:t>Cognition</w:t>
+      </w:r>
+      <w:r>
+        <w:rPr>
+          <w:rFonts w:eastAsia="Times New Roman"/>
+          <w:sz w:val="20"/>
+          <w:szCs w:val="20"/>
+          <w:lang w:val="en-US"/>
+        </w:rPr>
+        <w:t xml:space="preserve"> </w:t>
+      </w:r>
+      <w:r>
+        <w:rPr>
+          <w:rFonts w:eastAsia="Times New Roman"/>
+          <w:sz w:val="20"/>
+          <w:szCs w:val="20"/>
+          <w:lang w:val="en-US"/>
+        </w:rPr>
+        <w:t>Lab</w:t>
+      </w:r>
+      <w:r>
+        <w:rPr>
+          <w:rFonts w:eastAsia="Times New Roman"/>
+          <w:sz w:val="20"/>
+          <w:szCs w:val="20"/>
+          <w:lang w:val="en-US"/>
+        </w:rPr>
+        <w:t xml:space="preserve"> </w:t>
+      </w:r>
+      <w:r>
+        <w:rPr>
+          <w:rFonts w:eastAsia="Times New Roman"/>
+          <w:sz w:val="20"/>
+          <w:szCs w:val="20"/>
+          <w:lang w:val="en-US"/>
+        </w:rPr>
+        <w:t>Meeting</w:t>
+      </w:r>
+      <w:r>
+        <w:rPr>
+          <w:rFonts w:eastAsia="Times New Roman"/>
+          <w:sz w:val="20"/>
+          <w:szCs w:val="20"/>
+          <w:lang w:val="en-US"/>
+        </w:rPr>
+        <w:t xml:space="preserve">, </w:t>
+      </w:r>
+      <w:r>
+        <w:rPr>
+          <w:rFonts w:eastAsia="Times New Roman"/>
+          <w:sz w:val="20"/>
+          <w:szCs w:val="20"/>
+          <w:lang w:val="en-US"/>
+        </w:rPr>
+        <w:t>Koç</w:t>
+      </w:r>
+      <w:r>
+        <w:rPr>
+          <w:rFonts w:eastAsia="Times New Roman"/>
+          <w:sz w:val="20"/>
+          <w:szCs w:val="20"/>
+          <w:lang w:val="en-US"/>
+        </w:rPr>
+        <w:t xml:space="preserve"> University, </w:t>
+      </w:r>
+      <w:r>
+        <w:rPr>
+          <w:rFonts w:eastAsia="Times New Roman"/>
+          <w:sz w:val="20"/>
+          <w:szCs w:val="20"/>
+          <w:lang w:val="en-US"/>
+        </w:rPr>
+        <w:t>Turkey</w:t>
+      </w:r>
+    </w:p>
+    <w:p>
+      <w:pPr>
+        <w:pStyle w:val="Standard"/>
+        <w:spacing w:beforeLines="40" w:before="96"/>
+        <w:ind w:left="2120" w:hanging="2120"/>
+        <w:rPr>
+          <w:rFonts w:eastAsia="Times New Roman"/>
+          <w:sz w:val="20"/>
+          <w:szCs w:val="20"/>
+          <w:lang w:val="en-US"/>
+        </w:rPr>
+      </w:pPr>
+      <w:r>
+        <w:rPr>
+          <w:rFonts w:eastAsia="Times New Roman"/>
+          <w:sz w:val="20"/>
+          <w:szCs w:val="20"/>
+          <w:lang w:val="en-US"/>
+        </w:rPr>
+        <w:t>2024</w:t>
+      </w:r>
+      <w:r>
+        <w:rPr>
+          <w:rFonts w:eastAsia="Times New Roman"/>
+          <w:sz w:val="20"/>
+          <w:szCs w:val="20"/>
+          <w:lang w:val="en-US"/>
+        </w:rPr>
+        <w:tab/>
+      </w:r>
+      <w:r>
+        <w:rPr>
+          <w:rFonts w:eastAsia="Times New Roman"/>
+          <w:sz w:val="20"/>
+          <w:szCs w:val="20"/>
+          <w:lang w:val="en-US"/>
+        </w:rPr>
+        <w:t>“A communicative account of gesturing when speaking is difficult.”</w:t>
+      </w:r>
+    </w:p>
+    <w:p>
+      <w:pPr>
+        <w:pStyle w:val="Standard"/>
+        <w:spacing w:beforeLines="40" w:before="96"/>
+        <w:ind w:left="2120" w:hanging="2120"/>
+        <w:rPr>
+          <w:rFonts w:eastAsia="Times New Roman"/>
+          <w:sz w:val="20"/>
+          <w:szCs w:val="20"/>
+          <w:lang w:val="en-US"/>
+        </w:rPr>
+      </w:pPr>
+      <w:r>
+        <w:rPr>
+          <w:rFonts w:eastAsia="Times New Roman"/>
+          <w:sz w:val="20"/>
+          <w:szCs w:val="20"/>
+          <w:lang w:val="en-US"/>
+        </w:rPr>
         <w:tab/>
       </w:r>
       <w:r>
@@ -2453,6 +2718,7 @@
           <w:rFonts w:ascii="Arial" w:hAnsi="Arial" w:cs="Arial"/>
           <w:sz w:val="20"/>
           <w:szCs w:val="20"/>
+          <w:lang w:val="de-DE"/>
         </w:rPr>
         <w:t>Kısa</w:t>
       </w:r>
@@ -2462,48 +2728,130 @@
           <w:rFonts w:ascii="Arial" w:hAnsi="Arial" w:cs="Arial"/>
           <w:sz w:val="20"/>
           <w:szCs w:val="20"/>
-        </w:rPr>
-        <w:t xml:space="preserve"> Y.D., Stengelin, R., Maurits, L. &amp; Haun. D. B. M. (2024, July). </w:t>
+          <w:lang w:val="de-DE"/>
+        </w:rPr>
+        <w:t xml:space="preserve"> Y.D., Stengelin, R. </w:t>
       </w:r>
       <w:r>
         <w:rPr>
           <w:rFonts w:ascii="Arial" w:hAnsi="Arial" w:cs="Arial"/>
           <w:sz w:val="20"/>
           <w:szCs w:val="20"/>
-        </w:rPr>
-        <w:t>Is magnetoreception experience-dependent in humans?</w:t>
+          <w:lang w:val="de-DE"/>
+        </w:rPr>
+        <w:t xml:space="preserve">&amp; Haun. D. B. M. </w:t>
       </w:r>
       <w:r>
         <w:rPr>
           <w:rFonts w:ascii="Arial" w:hAnsi="Arial" w:cs="Arial"/>
           <w:sz w:val="20"/>
           <w:szCs w:val="20"/>
-        </w:rPr>
-        <w:t xml:space="preserve"> Poster presented </w:t>
+          <w:lang w:val="de-DE"/>
+        </w:rPr>
+        <w:t>(</w:t>
       </w:r>
       <w:r>
         <w:rPr>
           <w:rFonts w:ascii="Arial" w:hAnsi="Arial" w:cs="Arial"/>
           <w:sz w:val="20"/>
           <w:szCs w:val="20"/>
-        </w:rPr>
-        <w:t>at the 46th</w:t>
+          <w:lang w:val="de-DE"/>
+        </w:rPr>
+        <w:t>2026</w:t>
       </w:r>
       <w:r>
         <w:rPr>
           <w:rFonts w:ascii="Arial" w:hAnsi="Arial" w:cs="Arial"/>
           <w:sz w:val="20"/>
           <w:szCs w:val="20"/>
-        </w:rPr>
-        <w:t xml:space="preserve"> Annual Conference of the Cognitive Science Society</w:t>
-      </w:r>
+          <w:lang w:val="de-DE"/>
+        </w:rPr>
+        <w:t xml:space="preserve">, </w:t>
+      </w:r>
+      <w:proofErr w:type="spellStart"/>
       <w:r>
         <w:rPr>
           <w:rFonts w:ascii="Arial" w:hAnsi="Arial" w:cs="Arial"/>
           <w:sz w:val="20"/>
           <w:szCs w:val="20"/>
-        </w:rPr>
-        <w:t xml:space="preserve">, Rotterdam, Netherlands. </w:t>
+          <w:lang w:val="de-DE"/>
+        </w:rPr>
+        <w:t>January</w:t>
+      </w:r>
+      <w:proofErr w:type="spellEnd"/>
+      <w:r>
+        <w:rPr>
+          <w:rFonts w:ascii="Arial" w:hAnsi="Arial" w:cs="Arial"/>
+          <w:sz w:val="20"/>
+          <w:szCs w:val="20"/>
+          <w:lang w:val="de-DE"/>
+        </w:rPr>
+        <w:t>).</w:t>
+      </w:r>
+      <w:r>
+        <w:rPr>
+          <w:rFonts w:ascii="Arial" w:hAnsi="Arial" w:cs="Arial"/>
+          <w:sz w:val="20"/>
+          <w:szCs w:val="20"/>
+          <w:lang w:val="de-DE"/>
+        </w:rPr>
+        <w:t xml:space="preserve"> </w:t>
+      </w:r>
+      <w:r>
+        <w:rPr>
+          <w:rFonts w:ascii="Arial" w:hAnsi="Arial" w:cs="Arial"/>
+          <w:sz w:val="20"/>
+          <w:szCs w:val="20"/>
+        </w:rPr>
+        <w:t>The cultural origins of egocentric thinking in children</w:t>
+      </w:r>
+      <w:r>
+        <w:rPr>
+          <w:rFonts w:ascii="Arial" w:hAnsi="Arial" w:cs="Arial"/>
+          <w:sz w:val="20"/>
+          <w:szCs w:val="20"/>
+        </w:rPr>
+        <w:t>.</w:t>
+      </w:r>
+      <w:r>
+        <w:rPr>
+          <w:rFonts w:ascii="Arial" w:hAnsi="Arial" w:cs="Arial"/>
+          <w:sz w:val="20"/>
+          <w:szCs w:val="20"/>
+        </w:rPr>
+        <w:t xml:space="preserve"> </w:t>
+      </w:r>
+      <w:r>
+        <w:rPr>
+          <w:rFonts w:ascii="Arial" w:hAnsi="Arial" w:cs="Arial"/>
+          <w:sz w:val="20"/>
+          <w:szCs w:val="20"/>
+        </w:rPr>
+        <w:t>Paper</w:t>
+      </w:r>
+      <w:r>
+        <w:rPr>
+          <w:rFonts w:ascii="Arial" w:hAnsi="Arial" w:cs="Arial"/>
+          <w:sz w:val="20"/>
+          <w:szCs w:val="20"/>
+        </w:rPr>
+        <w:t xml:space="preserve"> presented at the 1</w:t>
+      </w:r>
+      <w:r>
+        <w:rPr>
+          <w:rFonts w:ascii="Arial" w:hAnsi="Arial" w:cs="Arial"/>
+          <w:sz w:val="20"/>
+          <w:szCs w:val="20"/>
+        </w:rPr>
+        <w:t>6</w:t>
+      </w:r>
+      <w:r>
+        <w:rPr>
+          <w:rFonts w:ascii="Arial" w:hAnsi="Arial" w:cs="Arial"/>
+          <w:sz w:val="20"/>
+          <w:szCs w:val="20"/>
+        </w:rPr>
+        <w:t>th Budapest CEU Conference on Cognitive Development, Budapest, Hungary.</w:t>
       </w:r>
     </w:p>
     <w:p>
@@ -2534,8 +2882,9 @@
           <w:szCs w:val="20"/>
           <w:lang w:val="de-DE"/>
         </w:rPr>
-        <w:t xml:space="preserve"> Y.D., Stengelin, R. </w:t>
-      </w:r>
+        <w:t xml:space="preserve"> Y.D., Stengelin, R., Maurits, L. &amp; Haun. D. B. M. (2024, </w:t>
+      </w:r>
+      <w:proofErr w:type="spellStart"/>
       <w:r>
         <w:rPr>
           <w:rFonts w:ascii="Arial" w:hAnsi="Arial" w:cs="Arial"/>
@@ -2543,8 +2892,9 @@
           <w:szCs w:val="20"/>
           <w:lang w:val="de-DE"/>
         </w:rPr>
-        <w:t xml:space="preserve">&amp; Haun. D. B. M. </w:t>
-      </w:r>
+        <w:t>July</w:t>
+      </w:r>
+      <w:proofErr w:type="spellEnd"/>
       <w:r>
         <w:rPr>
           <w:rFonts w:ascii="Arial" w:hAnsi="Arial" w:cs="Arial"/>
@@ -2552,7 +2902,7 @@
           <w:szCs w:val="20"/>
           <w:lang w:val="de-DE"/>
         </w:rPr>
-        <w:t xml:space="preserve">(2024, May). </w:t>
+        <w:t xml:space="preserve">). </w:t>
       </w:r>
       <w:r>
         <w:rPr>
@@ -2560,25 +2910,23 @@
           <w:sz w:val="20"/>
           <w:szCs w:val="20"/>
         </w:rPr>
-        <w:t>Historical origins of diversity in spatial cognition: Evidence against the Whorfian view from ≠</w:t>
-      </w:r>
-      <w:proofErr w:type="spellStart"/>
+        <w:t>Is magnetoreception experience-dependent in humans?</w:t>
+      </w:r>
       <w:r>
         <w:rPr>
           <w:rFonts w:ascii="Arial" w:hAnsi="Arial" w:cs="Arial"/>
           <w:sz w:val="20"/>
           <w:szCs w:val="20"/>
         </w:rPr>
-        <w:t>Akhoe</w:t>
-      </w:r>
-      <w:proofErr w:type="spellEnd"/>
+        <w:t xml:space="preserve"> Poster presented </w:t>
+      </w:r>
       <w:r>
         <w:rPr>
           <w:rFonts w:ascii="Arial" w:hAnsi="Arial" w:cs="Arial"/>
           <w:sz w:val="20"/>
           <w:szCs w:val="20"/>
         </w:rPr>
-        <w:t xml:space="preserve"> Hai||om speakers</w:t>
+        <w:t>at the 46th</w:t>
       </w:r>
       <w:r>
         <w:rPr>
@@ -2586,7 +2934,7 @@
           <w:sz w:val="20"/>
           <w:szCs w:val="20"/>
         </w:rPr>
-        <w:t>.</w:t>
+        <w:t xml:space="preserve"> Annual Conference of the Cognitive Science Society</w:t>
       </w:r>
       <w:r>
         <w:rPr>
@@ -2594,47 +2942,7 @@
           <w:sz w:val="20"/>
           <w:szCs w:val="20"/>
         </w:rPr>
-        <w:t xml:space="preserve"> Poster presented </w:t>
-      </w:r>
-      <w:r>
-        <w:rPr>
-          <w:rFonts w:ascii="Arial" w:hAnsi="Arial" w:cs="Arial"/>
-          <w:sz w:val="20"/>
-          <w:szCs w:val="20"/>
-        </w:rPr>
-        <w:t xml:space="preserve">at the </w:t>
-      </w:r>
-      <w:r>
-        <w:rPr>
-          <w:rFonts w:ascii="Arial" w:hAnsi="Arial" w:cs="Arial"/>
-          <w:sz w:val="20"/>
-          <w:szCs w:val="20"/>
-        </w:rPr>
-        <w:t>15th Dubrovnik Conference on Cognitive Science</w:t>
-      </w:r>
-      <w:r>
-        <w:rPr>
-          <w:rFonts w:ascii="Arial" w:hAnsi="Arial" w:cs="Arial"/>
-          <w:sz w:val="20"/>
-          <w:szCs w:val="20"/>
-        </w:rPr>
-        <w:t xml:space="preserve">, </w:t>
-      </w:r>
-      <w:r>
-        <w:rPr>
-          <w:rFonts w:ascii="Arial" w:hAnsi="Arial" w:cs="Arial"/>
-          <w:sz w:val="20"/>
-          <w:szCs w:val="20"/>
-        </w:rPr>
-        <w:t>Dubrovnik</w:t>
-      </w:r>
-      <w:r>
-        <w:rPr>
-          <w:rFonts w:ascii="Arial" w:hAnsi="Arial" w:cs="Arial"/>
-          <w:sz w:val="20"/>
-          <w:szCs w:val="20"/>
-        </w:rPr>
-        <w:t xml:space="preserve">, Croatia. </w:t>
+        <w:t xml:space="preserve">, Rotterdam, Netherlands. </w:t>
       </w:r>
     </w:p>
     <w:p>
@@ -2653,6 +2961,7 @@
           <w:rFonts w:ascii="Arial" w:hAnsi="Arial" w:cs="Arial"/>
           <w:sz w:val="20"/>
           <w:szCs w:val="20"/>
+          <w:lang w:val="de-DE"/>
         </w:rPr>
         <w:t>Kısa</w:t>
       </w:r>
@@ -2662,24 +2971,109 @@
           <w:rFonts w:ascii="Arial" w:hAnsi="Arial" w:cs="Arial"/>
           <w:sz w:val="20"/>
           <w:szCs w:val="20"/>
-        </w:rPr>
-        <w:t xml:space="preserve"> Y.D., Achen, C., Goldin-Meadow, S. &amp; Casasanto, D. (2022, July). Why do people gesture more during disfluent speech? A pragmatic account. Poster presented </w:t>
+          <w:lang w:val="de-DE"/>
+        </w:rPr>
+        <w:t xml:space="preserve"> Y.D., Stengelin, R. </w:t>
       </w:r>
       <w:r>
         <w:rPr>
           <w:rFonts w:ascii="Arial" w:hAnsi="Arial" w:cs="Arial"/>
           <w:sz w:val="20"/>
           <w:szCs w:val="20"/>
-        </w:rPr>
-        <w:t xml:space="preserve">at </w:t>
+          <w:lang w:val="de-DE"/>
+        </w:rPr>
+        <w:t xml:space="preserve">&amp; Haun. D. B. M. </w:t>
       </w:r>
       <w:r>
         <w:rPr>
           <w:rFonts w:ascii="Arial" w:hAnsi="Arial" w:cs="Arial"/>
           <w:sz w:val="20"/>
           <w:szCs w:val="20"/>
-        </w:rPr>
-        <w:t>the 44th Annual Conference of the Cognitive Science Society.</w:t>
+          <w:lang w:val="de-DE"/>
+        </w:rPr>
+        <w:t xml:space="preserve">(2024, May). </w:t>
+      </w:r>
+      <w:r>
+        <w:rPr>
+          <w:rFonts w:ascii="Arial" w:hAnsi="Arial" w:cs="Arial"/>
+          <w:sz w:val="20"/>
+          <w:szCs w:val="20"/>
+        </w:rPr>
+        <w:t>Historical origins of diversity in spatial cognition: Evidence against the Whorfian view from ≠</w:t>
+      </w:r>
+      <w:proofErr w:type="spellStart"/>
+      <w:r>
+        <w:rPr>
+          <w:rFonts w:ascii="Arial" w:hAnsi="Arial" w:cs="Arial"/>
+          <w:sz w:val="20"/>
+          <w:szCs w:val="20"/>
+        </w:rPr>
+        <w:t>Akhoe</w:t>
+      </w:r>
+      <w:proofErr w:type="spellEnd"/>
+      <w:r>
+        <w:rPr>
+          <w:rFonts w:ascii="Arial" w:hAnsi="Arial" w:cs="Arial"/>
+          <w:sz w:val="20"/>
+          <w:szCs w:val="20"/>
+        </w:rPr>
+        <w:t xml:space="preserve"> Hai||om speakers</w:t>
+      </w:r>
+      <w:r>
+        <w:rPr>
+          <w:rFonts w:ascii="Arial" w:hAnsi="Arial" w:cs="Arial"/>
+          <w:sz w:val="20"/>
+          <w:szCs w:val="20"/>
+        </w:rPr>
+        <w:t>.</w:t>
+      </w:r>
+      <w:r>
+        <w:rPr>
+          <w:rFonts w:ascii="Arial" w:hAnsi="Arial" w:cs="Arial"/>
+          <w:sz w:val="20"/>
+          <w:szCs w:val="20"/>
+        </w:rPr>
+        <w:t xml:space="preserve"> Poster presented </w:t>
+      </w:r>
+      <w:r>
+        <w:rPr>
+          <w:rFonts w:ascii="Arial" w:hAnsi="Arial" w:cs="Arial"/>
+          <w:sz w:val="20"/>
+          <w:szCs w:val="20"/>
+        </w:rPr>
+        <w:t xml:space="preserve">at the </w:t>
+      </w:r>
+      <w:r>
+        <w:rPr>
+          <w:rFonts w:ascii="Arial" w:hAnsi="Arial" w:cs="Arial"/>
+          <w:sz w:val="20"/>
+          <w:szCs w:val="20"/>
+        </w:rPr>
+        <w:t>15th Dubrovnik Conference on Cognitive Science</w:t>
+      </w:r>
+      <w:r>
+        <w:rPr>
+          <w:rFonts w:ascii="Arial" w:hAnsi="Arial" w:cs="Arial"/>
+          <w:sz w:val="20"/>
+          <w:szCs w:val="20"/>
+        </w:rPr>
+        <w:t xml:space="preserve">, </w:t>
+      </w:r>
+      <w:r>
+        <w:rPr>
+          <w:rFonts w:ascii="Arial" w:hAnsi="Arial" w:cs="Arial"/>
+          <w:sz w:val="20"/>
+          <w:szCs w:val="20"/>
+        </w:rPr>
+        <w:t>Dubrovnik</w:t>
+      </w:r>
+      <w:r>
+        <w:rPr>
+          <w:rFonts w:ascii="Arial" w:hAnsi="Arial" w:cs="Arial"/>
+          <w:sz w:val="20"/>
+          <w:szCs w:val="20"/>
+        </w:rPr>
+        <w:t xml:space="preserve">, Croatia. </w:t>
       </w:r>
     </w:p>
     <w:p>
@@ -2708,7 +3102,23 @@
           <w:sz w:val="20"/>
           <w:szCs w:val="20"/>
         </w:rPr>
-        <w:t xml:space="preserve"> Y.D., Goldin-Meadow, S. &amp; Casasanto, D. (2022, July). Do gestures really facilitate speech production? 9th Conference of the International Society for Gesture Studies, Chicago, IL.</w:t>
+        <w:t xml:space="preserve"> Y.D., Achen, C., Goldin-Meadow, S. &amp; Casasanto, D. (2022, July). Why do people gesture more during disfluent speech? A pragmatic account. Poster presented </w:t>
+      </w:r>
+      <w:r>
+        <w:rPr>
+          <w:rFonts w:ascii="Arial" w:hAnsi="Arial" w:cs="Arial"/>
+          <w:sz w:val="20"/>
+          <w:szCs w:val="20"/>
+        </w:rPr>
+        <w:t xml:space="preserve">at </w:t>
+      </w:r>
+      <w:r>
+        <w:rPr>
+          <w:rFonts w:ascii="Arial" w:hAnsi="Arial" w:cs="Arial"/>
+          <w:sz w:val="20"/>
+          <w:szCs w:val="20"/>
+        </w:rPr>
+        <w:t>the 44th Annual Conference of the Cognitive Science Society.</w:t>
       </w:r>
     </w:p>
     <w:p>
@@ -2737,7 +3147,7 @@
           <w:sz w:val="20"/>
           <w:szCs w:val="20"/>
         </w:rPr>
-        <w:t xml:space="preserve"> Y.D., Achen, C., Goldin-Meadow, S. &amp; Casasanto, D. (2022, July). Why do people gesture more during disfluent speech? A pragmatic account. 9th Conference of the International Society for Gesture Studies, Chicago, IL.</w:t>
+        <w:t xml:space="preserve"> Y.D., Goldin-Meadow, S. &amp; Casasanto, D. (2022, July). Do gestures really facilitate speech production? 9th Conference of the International Society for Gesture Studies, Chicago, IL.</w:t>
       </w:r>
     </w:p>
     <w:p>
@@ -2766,23 +3176,7 @@
           <w:sz w:val="20"/>
           <w:szCs w:val="20"/>
         </w:rPr>
-        <w:t xml:space="preserve"> Y.D., Goldin-Meadow, S. &amp; Casasanto, D. (2021, July). Do gestures really facilitate speech production? Paper presented </w:t>
-      </w:r>
-      <w:r>
-        <w:rPr>
-          <w:rFonts w:ascii="Arial" w:hAnsi="Arial" w:cs="Arial"/>
-          <w:sz w:val="20"/>
-          <w:szCs w:val="20"/>
-        </w:rPr>
-        <w:t xml:space="preserve">at </w:t>
-      </w:r>
-      <w:r>
-        <w:rPr>
-          <w:rFonts w:ascii="Arial" w:hAnsi="Arial" w:cs="Arial"/>
-          <w:sz w:val="20"/>
-          <w:szCs w:val="20"/>
-        </w:rPr>
-        <w:t>the 43rd Annual Conference of the Cognitive Science Society.</w:t>
+        <w:t xml:space="preserve"> Y.D., Achen, C., Goldin-Meadow, S. &amp; Casasanto, D. (2022, July). Why do people gesture more during disfluent speech? A pragmatic account. 9th Conference of the International Society for Gesture Studies, Chicago, IL.</w:t>
       </w:r>
     </w:p>
     <w:p>
@@ -2811,7 +3205,7 @@
           <w:sz w:val="20"/>
           <w:szCs w:val="20"/>
         </w:rPr>
-        <w:t xml:space="preserve"> Y.D., Achen, C., Goldin-Meadow, S. &amp; Casasanto, D. (2021, May). Pragmatic function of gestures. </w:t>
+        <w:t xml:space="preserve"> Y.D., Goldin-Meadow, S. &amp; Casasanto, D. (2021, July). Do gestures really facilitate speech production? Paper presented </w:t>
       </w:r>
       <w:r>
         <w:rPr>
@@ -2819,7 +3213,7 @@
           <w:sz w:val="20"/>
           <w:szCs w:val="20"/>
         </w:rPr>
-        <w:t xml:space="preserve">Paper presented at the </w:t>
+        <w:t xml:space="preserve">at </w:t>
       </w:r>
       <w:r>
         <w:rPr>
@@ -2827,7 +3221,7 @@
           <w:sz w:val="20"/>
           <w:szCs w:val="20"/>
         </w:rPr>
-        <w:t>2021 APS Virtual Convention.</w:t>
+        <w:t>the 43rd Annual Conference of the Cognitive Science Society.</w:t>
       </w:r>
     </w:p>
     <w:p>
@@ -2840,31 +3234,31 @@
           <w:szCs w:val="20"/>
         </w:rPr>
       </w:pPr>
+      <w:proofErr w:type="spellStart"/>
       <w:r>
         <w:rPr>
           <w:rFonts w:ascii="Arial" w:hAnsi="Arial" w:cs="Arial"/>
           <w:sz w:val="20"/>
           <w:szCs w:val="20"/>
         </w:rPr>
-        <w:t xml:space="preserve">Bergey, C. A., </w:t>
-      </w:r>
-      <w:proofErr w:type="spellStart"/>
+        <w:t>Kısa</w:t>
+      </w:r>
+      <w:proofErr w:type="spellEnd"/>
       <w:r>
         <w:rPr>
           <w:rFonts w:ascii="Arial" w:hAnsi="Arial" w:cs="Arial"/>
           <w:sz w:val="20"/>
           <w:szCs w:val="20"/>
         </w:rPr>
-        <w:t>Kısa</w:t>
-      </w:r>
-      <w:proofErr w:type="spellEnd"/>
+        <w:t xml:space="preserve"> Y.D., Achen, C., Goldin-Meadow, S. &amp; Casasanto, D. (2021, May). Pragmatic function of gestures. </w:t>
+      </w:r>
       <w:r>
         <w:rPr>
           <w:rFonts w:ascii="Arial" w:hAnsi="Arial" w:cs="Arial"/>
           <w:sz w:val="20"/>
           <w:szCs w:val="20"/>
         </w:rPr>
-        <w:t xml:space="preserve"> Y.D., Casasanto, D. &amp; Yurovsky, D. (2020, July). </w:t>
+        <w:t xml:space="preserve">Paper presented at the </w:t>
       </w:r>
       <w:r>
         <w:rPr>
@@ -2872,31 +3266,7 @@
           <w:sz w:val="20"/>
           <w:szCs w:val="20"/>
         </w:rPr>
-        <w:t xml:space="preserve">Where does the conceptual space–time asymmetry come from? </w:t>
-      </w:r>
-      <w:r>
-        <w:rPr>
-          <w:rFonts w:ascii="Arial" w:hAnsi="Arial" w:cs="Arial"/>
-          <w:sz w:val="20"/>
-          <w:szCs w:val="20"/>
-        </w:rPr>
-        <w:t xml:space="preserve">Poster presented </w:t>
-      </w:r>
-      <w:r>
-        <w:rPr>
-          <w:rFonts w:ascii="Arial" w:hAnsi="Arial" w:cs="Arial"/>
-          <w:sz w:val="20"/>
-          <w:szCs w:val="20"/>
-        </w:rPr>
-        <w:t xml:space="preserve">at </w:t>
-      </w:r>
-      <w:r>
-        <w:rPr>
-          <w:rFonts w:ascii="Arial" w:hAnsi="Arial" w:cs="Arial"/>
-          <w:sz w:val="20"/>
-          <w:szCs w:val="20"/>
-        </w:rPr>
-        <w:t xml:space="preserve">the 42nd Annual Conference of the Cognitive Science Society. </w:t>
+        <w:t>2021 APS Virtual Convention.</w:t>
       </w:r>
     </w:p>
     <w:p>
@@ -2909,13 +3279,22 @@
           <w:szCs w:val="20"/>
         </w:rPr>
       </w:pPr>
-      <w:proofErr w:type="spellStart"/>
       <w:r>
         <w:rPr>
           <w:rFonts w:ascii="Arial" w:hAnsi="Arial" w:cs="Arial"/>
           <w:sz w:val="20"/>
           <w:szCs w:val="20"/>
         </w:rPr>
+        <w:lastRenderedPageBreak/>
+        <w:t xml:space="preserve">Bergey, C. A., </w:t>
+      </w:r>
+      <w:proofErr w:type="spellStart"/>
+      <w:r>
+        <w:rPr>
+          <w:rFonts w:ascii="Arial" w:hAnsi="Arial" w:cs="Arial"/>
+          <w:sz w:val="20"/>
+          <w:szCs w:val="20"/>
+        </w:rPr>
         <w:t>Kısa</w:t>
       </w:r>
       <w:proofErr w:type="spellEnd"/>
@@ -2925,7 +3304,7 @@
           <w:sz w:val="20"/>
           <w:szCs w:val="20"/>
         </w:rPr>
-        <w:t xml:space="preserve"> Y.</w:t>
+        <w:t xml:space="preserve"> Y.D., Casasanto, D. &amp; Yurovsky, D. (2020, July). </w:t>
       </w:r>
       <w:r>
         <w:rPr>
@@ -2933,7 +3312,7 @@
           <w:sz w:val="20"/>
           <w:szCs w:val="20"/>
         </w:rPr>
-        <w:t>D</w:t>
+        <w:t xml:space="preserve">Where does the conceptual space–time asymmetry come from? </w:t>
       </w:r>
       <w:r>
         <w:rPr>
@@ -2941,7 +3320,23 @@
           <w:sz w:val="20"/>
           <w:szCs w:val="20"/>
         </w:rPr>
-        <w:t>., Goldin-Meadow, S. &amp; Casasanto, D. (2020, June-September). Do gestures facilitate speech production? Poster presented at the Association for Psychological Science Poster Showcase.</w:t>
+        <w:t xml:space="preserve">Poster presented </w:t>
+      </w:r>
+      <w:r>
+        <w:rPr>
+          <w:rFonts w:ascii="Arial" w:hAnsi="Arial" w:cs="Arial"/>
+          <w:sz w:val="20"/>
+          <w:szCs w:val="20"/>
+        </w:rPr>
+        <w:t xml:space="preserve">at </w:t>
+      </w:r>
+      <w:r>
+        <w:rPr>
+          <w:rFonts w:ascii="Arial" w:hAnsi="Arial" w:cs="Arial"/>
+          <w:sz w:val="20"/>
+          <w:szCs w:val="20"/>
+        </w:rPr>
+        <w:t xml:space="preserve">the 42nd Annual Conference of the Cognitive Science Society. </w:t>
       </w:r>
     </w:p>
     <w:p>
@@ -2954,31 +3349,31 @@
           <w:szCs w:val="20"/>
         </w:rPr>
       </w:pPr>
+      <w:proofErr w:type="spellStart"/>
       <w:r>
         <w:rPr>
           <w:rFonts w:ascii="Arial" w:hAnsi="Arial" w:cs="Arial"/>
           <w:sz w:val="20"/>
           <w:szCs w:val="20"/>
         </w:rPr>
-        <w:t xml:space="preserve">Casasanto, D. &amp; </w:t>
-      </w:r>
-      <w:proofErr w:type="spellStart"/>
+        <w:t>Kısa</w:t>
+      </w:r>
+      <w:proofErr w:type="spellEnd"/>
       <w:r>
         <w:rPr>
           <w:rFonts w:ascii="Arial" w:hAnsi="Arial" w:cs="Arial"/>
           <w:sz w:val="20"/>
           <w:szCs w:val="20"/>
         </w:rPr>
-        <w:t>Kısa</w:t>
-      </w:r>
-      <w:proofErr w:type="spellEnd"/>
+        <w:t xml:space="preserve"> Y.</w:t>
+      </w:r>
       <w:r>
         <w:rPr>
           <w:rFonts w:ascii="Arial" w:hAnsi="Arial" w:cs="Arial"/>
           <w:sz w:val="20"/>
           <w:szCs w:val="20"/>
         </w:rPr>
-        <w:t xml:space="preserve">, Y. D. (2019, July). Origins of cross-domain asymmetries. Poster presented </w:t>
+        <w:t>D</w:t>
       </w:r>
       <w:r>
         <w:rPr>
@@ -2986,23 +3381,7 @@
           <w:sz w:val="20"/>
           <w:szCs w:val="20"/>
         </w:rPr>
-        <w:t xml:space="preserve">at </w:t>
-      </w:r>
-      <w:r>
-        <w:rPr>
-          <w:rFonts w:ascii="Arial" w:hAnsi="Arial" w:cs="Arial"/>
-          <w:sz w:val="20"/>
-          <w:szCs w:val="20"/>
-        </w:rPr>
-        <w:t>the 41st Annual Conference of the Cognitive Science Society, Montreal, Quebec, Canada. </w:t>
-      </w:r>
-      <w:r>
-        <w:rPr>
-          <w:rFonts w:ascii="Arial" w:hAnsi="Arial" w:cs="Arial"/>
-          <w:sz w:val="20"/>
-          <w:szCs w:val="20"/>
-        </w:rPr>
-        <w:t xml:space="preserve"> </w:t>
+        <w:t>., Goldin-Meadow, S. &amp; Casasanto, D. (2020, June-September). Do gestures facilitate speech production? Poster presented at the Association for Psychological Science Poster Showcase.</w:t>
       </w:r>
     </w:p>
     <w:p>
@@ -3039,7 +3418,31 @@
           <w:sz w:val="20"/>
           <w:szCs w:val="20"/>
         </w:rPr>
-        <w:t>, Y. D. (2019, May). Origins of cross-domain asymmetries. Poster presented at the 31th annual convention of the Association for Psychological Science, Washington, D.C.</w:t>
+        <w:t xml:space="preserve">, Y. D. (2019, July). Origins of cross-domain asymmetries. Poster presented </w:t>
+      </w:r>
+      <w:r>
+        <w:rPr>
+          <w:rFonts w:ascii="Arial" w:hAnsi="Arial" w:cs="Arial"/>
+          <w:sz w:val="20"/>
+          <w:szCs w:val="20"/>
+        </w:rPr>
+        <w:t xml:space="preserve">at </w:t>
+      </w:r>
+      <w:r>
+        <w:rPr>
+          <w:rFonts w:ascii="Arial" w:hAnsi="Arial" w:cs="Arial"/>
+          <w:sz w:val="20"/>
+          <w:szCs w:val="20"/>
+        </w:rPr>
+        <w:t>the 41st Annual Conference of the Cognitive Science Society, Montreal, Quebec, Canada. </w:t>
+      </w:r>
+      <w:r>
+        <w:rPr>
+          <w:rFonts w:ascii="Arial" w:hAnsi="Arial" w:cs="Arial"/>
+          <w:sz w:val="20"/>
+          <w:szCs w:val="20"/>
+        </w:rPr>
+        <w:t xml:space="preserve"> </w:t>
       </w:r>
     </w:p>
     <w:p>
@@ -3052,14 +3455,21 @@
           <w:szCs w:val="20"/>
         </w:rPr>
       </w:pPr>
-      <w:proofErr w:type="spellStart"/>
       <w:r>
         <w:rPr>
           <w:rFonts w:ascii="Arial" w:hAnsi="Arial" w:cs="Arial"/>
           <w:sz w:val="20"/>
           <w:szCs w:val="20"/>
         </w:rPr>
-        <w:lastRenderedPageBreak/>
+        <w:t xml:space="preserve">Casasanto, D. &amp; </w:t>
+      </w:r>
+      <w:proofErr w:type="spellStart"/>
+      <w:r>
+        <w:rPr>
+          <w:rFonts w:ascii="Arial" w:hAnsi="Arial" w:cs="Arial"/>
+          <w:sz w:val="20"/>
+          <w:szCs w:val="20"/>
+        </w:rPr>
         <w:t>Kısa</w:t>
       </w:r>
       <w:proofErr w:type="spellEnd"/>
@@ -3069,7 +3479,7 @@
           <w:sz w:val="20"/>
           <w:szCs w:val="20"/>
         </w:rPr>
-        <w:t xml:space="preserve">, Y. D., Brooks, N. B. &amp; Goldin-Meadow, S. (2018, July). Chunking in gesture can facilitate mental abacus problem solving. 8th Conference of the International Society for Gesture Studies: Gesture and Diversity, Cape Town, South Africa. </w:t>
+        <w:t>, Y. D. (2019, May). Origins of cross-domain asymmetries. Poster presented at the 31th annual convention of the Association for Psychological Science, Washington, D.C.</w:t>
       </w:r>
     </w:p>
     <w:p>
@@ -3089,7 +3499,7 @@
           <w:sz w:val="20"/>
           <w:szCs w:val="20"/>
         </w:rPr>
-        <w:t>Sarıçimen</w:t>
+        <w:t>Kısa</w:t>
       </w:r>
       <w:proofErr w:type="spellEnd"/>
       <w:r>
@@ -3098,61 +3508,7 @@
           <w:sz w:val="20"/>
           <w:szCs w:val="20"/>
         </w:rPr>
-        <w:t xml:space="preserve">, İ., </w:t>
-      </w:r>
-      <w:proofErr w:type="spellStart"/>
-      <w:r>
-        <w:rPr>
-          <w:rFonts w:ascii="Arial" w:hAnsi="Arial" w:cs="Arial"/>
-          <w:sz w:val="20"/>
-          <w:szCs w:val="20"/>
-        </w:rPr>
-        <w:t>Kısa</w:t>
-      </w:r>
-      <w:proofErr w:type="spellEnd"/>
-      <w:r>
-        <w:rPr>
-          <w:rFonts w:ascii="Arial" w:hAnsi="Arial" w:cs="Arial"/>
-          <w:sz w:val="20"/>
-          <w:szCs w:val="20"/>
-        </w:rPr>
-        <w:t>, Y. D., Aktan-</w:t>
-      </w:r>
-      <w:proofErr w:type="spellStart"/>
-      <w:r>
-        <w:rPr>
-          <w:rFonts w:ascii="Arial" w:hAnsi="Arial" w:cs="Arial"/>
-          <w:sz w:val="20"/>
-          <w:szCs w:val="20"/>
-        </w:rPr>
-        <w:t>Erciyes</w:t>
-      </w:r>
-      <w:proofErr w:type="spellEnd"/>
-      <w:r>
-        <w:rPr>
-          <w:rFonts w:ascii="Arial" w:hAnsi="Arial" w:cs="Arial"/>
-          <w:sz w:val="20"/>
-          <w:szCs w:val="20"/>
-        </w:rPr>
-        <w:t xml:space="preserve">, A., &amp; </w:t>
-      </w:r>
-      <w:proofErr w:type="spellStart"/>
-      <w:r>
-        <w:rPr>
-          <w:rFonts w:ascii="Arial" w:hAnsi="Arial" w:cs="Arial"/>
-          <w:sz w:val="20"/>
-          <w:szCs w:val="20"/>
-        </w:rPr>
-        <w:t>Göksun</w:t>
-      </w:r>
-      <w:proofErr w:type="spellEnd"/>
-      <w:r>
-        <w:rPr>
-          <w:rFonts w:ascii="Arial" w:hAnsi="Arial" w:cs="Arial"/>
-          <w:sz w:val="20"/>
-          <w:szCs w:val="20"/>
-        </w:rPr>
-        <w:t xml:space="preserve">, T. (2017, July). Mothers' use of spatial language and spatial gestures. 14th International Congress for the Study of Child Language, Lyon, France. </w:t>
+        <w:t xml:space="preserve">, Y. D., Brooks, N. B. &amp; Goldin-Meadow, S. (2018, July). Chunking in gesture can facilitate mental abacus problem solving. 8th Conference of the International Society for Gesture Studies: Gesture and Diversity, Cape Town, South Africa. </w:t>
       </w:r>
     </w:p>
     <w:p>
@@ -3172,6 +3528,24 @@
           <w:sz w:val="20"/>
           <w:szCs w:val="20"/>
         </w:rPr>
+        <w:t>Sarıçimen</w:t>
+      </w:r>
+      <w:proofErr w:type="spellEnd"/>
+      <w:r>
+        <w:rPr>
+          <w:rFonts w:ascii="Arial" w:hAnsi="Arial" w:cs="Arial"/>
+          <w:sz w:val="20"/>
+          <w:szCs w:val="20"/>
+        </w:rPr>
+        <w:t xml:space="preserve">, İ., </w:t>
+      </w:r>
+      <w:proofErr w:type="spellStart"/>
+      <w:r>
+        <w:rPr>
+          <w:rFonts w:ascii="Arial" w:hAnsi="Arial" w:cs="Arial"/>
+          <w:sz w:val="20"/>
+          <w:szCs w:val="20"/>
+        </w:rPr>
         <w:t>Kısa</w:t>
       </w:r>
       <w:proofErr w:type="spellEnd"/>
@@ -3181,7 +3555,7 @@
           <w:sz w:val="20"/>
           <w:szCs w:val="20"/>
         </w:rPr>
-        <w:t xml:space="preserve">, Y.D., </w:t>
+        <w:t>, Y. D., Aktan-</w:t>
       </w:r>
       <w:proofErr w:type="spellStart"/>
       <w:r>
@@ -3190,7 +3564,7 @@
           <w:sz w:val="20"/>
           <w:szCs w:val="20"/>
         </w:rPr>
-        <w:t>Sariçimen</w:t>
+        <w:t>Erciyes</w:t>
       </w:r>
       <w:proofErr w:type="spellEnd"/>
       <w:r>
@@ -3199,7 +3573,7 @@
           <w:sz w:val="20"/>
           <w:szCs w:val="20"/>
         </w:rPr>
-        <w:t>, İ., Aktan-</w:t>
+        <w:t xml:space="preserve">, A., &amp; </w:t>
       </w:r>
       <w:proofErr w:type="spellStart"/>
       <w:r>
@@ -3208,7 +3582,7 @@
           <w:sz w:val="20"/>
           <w:szCs w:val="20"/>
         </w:rPr>
-        <w:t>Erciyes</w:t>
+        <w:t>Göksun</w:t>
       </w:r>
       <w:proofErr w:type="spellEnd"/>
       <w:r>
@@ -3217,25 +3591,7 @@
           <w:sz w:val="20"/>
           <w:szCs w:val="20"/>
         </w:rPr>
-        <w:t xml:space="preserve">, A., &amp; </w:t>
-      </w:r>
-      <w:proofErr w:type="spellStart"/>
-      <w:r>
-        <w:rPr>
-          <w:rFonts w:ascii="Arial" w:hAnsi="Arial" w:cs="Arial"/>
-          <w:sz w:val="20"/>
-          <w:szCs w:val="20"/>
-        </w:rPr>
-        <w:t>Göksun</w:t>
-      </w:r>
-      <w:proofErr w:type="spellEnd"/>
-      <w:r>
-        <w:rPr>
-          <w:rFonts w:ascii="Arial" w:hAnsi="Arial" w:cs="Arial"/>
-          <w:sz w:val="20"/>
-          <w:szCs w:val="20"/>
-        </w:rPr>
-        <w:t xml:space="preserve">, T. (2017, April). Learning relational words: A longitudinal study. Paper presented as part of the symposium in N. George (chair), Playing with words: How parents highlight event structure through language and gesture, at the Society for Research on Child Development, Austin, TX. </w:t>
+        <w:t xml:space="preserve">, T. (2017, July). Mothers' use of spatial language and spatial gestures. 14th International Congress for the Study of Child Language, Lyon, France. </w:t>
       </w:r>
     </w:p>
     <w:p>
@@ -3264,6 +3620,89 @@
           <w:sz w:val="20"/>
           <w:szCs w:val="20"/>
         </w:rPr>
+        <w:t xml:space="preserve">, Y.D., </w:t>
+      </w:r>
+      <w:proofErr w:type="spellStart"/>
+      <w:r>
+        <w:rPr>
+          <w:rFonts w:ascii="Arial" w:hAnsi="Arial" w:cs="Arial"/>
+          <w:sz w:val="20"/>
+          <w:szCs w:val="20"/>
+        </w:rPr>
+        <w:t>Sariçimen</w:t>
+      </w:r>
+      <w:proofErr w:type="spellEnd"/>
+      <w:r>
+        <w:rPr>
+          <w:rFonts w:ascii="Arial" w:hAnsi="Arial" w:cs="Arial"/>
+          <w:sz w:val="20"/>
+          <w:szCs w:val="20"/>
+        </w:rPr>
+        <w:t>, İ., Aktan-</w:t>
+      </w:r>
+      <w:proofErr w:type="spellStart"/>
+      <w:r>
+        <w:rPr>
+          <w:rFonts w:ascii="Arial" w:hAnsi="Arial" w:cs="Arial"/>
+          <w:sz w:val="20"/>
+          <w:szCs w:val="20"/>
+        </w:rPr>
+        <w:t>Erciyes</w:t>
+      </w:r>
+      <w:proofErr w:type="spellEnd"/>
+      <w:r>
+        <w:rPr>
+          <w:rFonts w:ascii="Arial" w:hAnsi="Arial" w:cs="Arial"/>
+          <w:sz w:val="20"/>
+          <w:szCs w:val="20"/>
+        </w:rPr>
+        <w:t xml:space="preserve">, A., &amp; </w:t>
+      </w:r>
+      <w:proofErr w:type="spellStart"/>
+      <w:r>
+        <w:rPr>
+          <w:rFonts w:ascii="Arial" w:hAnsi="Arial" w:cs="Arial"/>
+          <w:sz w:val="20"/>
+          <w:szCs w:val="20"/>
+        </w:rPr>
+        <w:t>Göksun</w:t>
+      </w:r>
+      <w:proofErr w:type="spellEnd"/>
+      <w:r>
+        <w:rPr>
+          <w:rFonts w:ascii="Arial" w:hAnsi="Arial" w:cs="Arial"/>
+          <w:sz w:val="20"/>
+          <w:szCs w:val="20"/>
+        </w:rPr>
+        <w:t xml:space="preserve">, T. (2017, April). Learning relational words: A longitudinal study. Paper presented as part of the symposium in N. George (chair), Playing with words: How parents highlight event structure through language and gesture, at the Society for Research on Child Development, Austin, TX. </w:t>
+      </w:r>
+    </w:p>
+    <w:p>
+      <w:pPr>
+        <w:spacing w:beforeLines="40" w:before="96" w:line="276" w:lineRule="auto"/>
+        <w:ind w:left="709" w:hanging="709"/>
+        <w:rPr>
+          <w:rFonts w:ascii="Arial" w:hAnsi="Arial" w:cs="Arial"/>
+          <w:sz w:val="20"/>
+          <w:szCs w:val="20"/>
+        </w:rPr>
+      </w:pPr>
+      <w:proofErr w:type="spellStart"/>
+      <w:r>
+        <w:rPr>
+          <w:rFonts w:ascii="Arial" w:hAnsi="Arial" w:cs="Arial"/>
+          <w:sz w:val="20"/>
+          <w:szCs w:val="20"/>
+        </w:rPr>
+        <w:t>Kısa</w:t>
+      </w:r>
+      <w:proofErr w:type="spellEnd"/>
+      <w:r>
+        <w:rPr>
+          <w:rFonts w:ascii="Arial" w:hAnsi="Arial" w:cs="Arial"/>
+          <w:sz w:val="20"/>
+          <w:szCs w:val="20"/>
+        </w:rPr>
         <w:t>, Y. D., Aktan-</w:t>
       </w:r>
       <w:proofErr w:type="spellStart"/>
@@ -3300,7 +3739,7 @@
           <w:sz w:val="20"/>
           <w:szCs w:val="20"/>
         </w:rPr>
-        <w:t xml:space="preserve">, T. (2017, January). A longitudinal study on learning spatial language in the first two years. Poster presented at the 17th </w:t>
+        <w:t xml:space="preserve">, T. (2017, January). A longitudinal study on learning spatial language in the first two years. Poster presented at the 7th </w:t>
       </w:r>
       <w:r>
         <w:rPr>
@@ -4317,6 +4756,7 @@
           <w:sz w:val="20"/>
           <w:szCs w:val="20"/>
         </w:rPr>
+        <w:lastRenderedPageBreak/>
         <w:t>Workshop (</w:t>
       </w:r>
       <w:proofErr w:type="spellStart"/>
@@ -4871,7 +5311,6 @@
           <w:sz w:val="20"/>
           <w:szCs w:val="20"/>
         </w:rPr>
-        <w:lastRenderedPageBreak/>
         <w:t>Discussion</w:t>
       </w:r>
       <w:proofErr w:type="spellEnd"/>
@@ -5587,6 +6026,7 @@
           <w:szCs w:val="20"/>
         </w:rPr>
       </w:pPr>
+      <w:proofErr w:type="spellStart"/>
       <w:r>
         <w:rPr>
           <w:i/>
@@ -5594,10 +6034,9 @@
           <w:sz w:val="20"/>
           <w:szCs w:val="20"/>
         </w:rPr>
-        <w:t xml:space="preserve">Child Development; </w:t>
-      </w:r>
-      <w:proofErr w:type="spellStart"/>
-      <w:proofErr w:type="gramStart"/>
+        <w:t>Journal</w:t>
+      </w:r>
+      <w:proofErr w:type="spellEnd"/>
       <w:r>
         <w:rPr>
           <w:i/>
@@ -5605,9 +6044,9 @@
           <w:sz w:val="20"/>
           <w:szCs w:val="20"/>
         </w:rPr>
-        <w:t>Gesture</w:t>
-      </w:r>
-      <w:proofErr w:type="spellEnd"/>
+        <w:t xml:space="preserve"> of </w:t>
+      </w:r>
+      <w:proofErr w:type="spellStart"/>
       <w:r>
         <w:rPr>
           <w:i/>
@@ -5615,9 +6054,9 @@
           <w:sz w:val="20"/>
           <w:szCs w:val="20"/>
         </w:rPr>
-        <w:t>;</w:t>
-      </w:r>
-      <w:proofErr w:type="gramEnd"/>
+        <w:t>Experimental</w:t>
+      </w:r>
+      <w:proofErr w:type="spellEnd"/>
       <w:r>
         <w:rPr>
           <w:i/>
@@ -5635,7 +6074,7 @@
           <w:sz w:val="20"/>
           <w:szCs w:val="20"/>
         </w:rPr>
-        <w:t>Journal</w:t>
+        <w:t>Psychology</w:t>
       </w:r>
       <w:proofErr w:type="spellEnd"/>
       <w:r>
@@ -5645,9 +6084,8 @@
           <w:sz w:val="20"/>
           <w:szCs w:val="20"/>
         </w:rPr>
-        <w:t xml:space="preserve"> of </w:t>
-      </w:r>
-      <w:proofErr w:type="spellStart"/>
+        <w:t>: General</w:t>
+      </w:r>
       <w:r>
         <w:rPr>
           <w:i/>
@@ -5655,9 +6093,9 @@
           <w:sz w:val="20"/>
           <w:szCs w:val="20"/>
         </w:rPr>
-        <w:t>Cognitive</w:t>
-      </w:r>
-      <w:proofErr w:type="spellEnd"/>
+        <w:t xml:space="preserve">; </w:t>
+      </w:r>
+      <w:proofErr w:type="spellStart"/>
       <w:r>
         <w:rPr>
           <w:i/>
@@ -5665,10 +6103,9 @@
           <w:sz w:val="20"/>
           <w:szCs w:val="20"/>
         </w:rPr>
-        <w:t xml:space="preserve"> </w:t>
-      </w:r>
-      <w:proofErr w:type="spellStart"/>
-      <w:proofErr w:type="gramStart"/>
+        <w:t>Developmental</w:t>
+      </w:r>
+      <w:proofErr w:type="spellEnd"/>
       <w:r>
         <w:rPr>
           <w:i/>
@@ -5676,75 +6113,65 @@
           <w:sz w:val="20"/>
           <w:szCs w:val="20"/>
         </w:rPr>
-        <w:t>Neuroscience</w:t>
-      </w:r>
-      <w:proofErr w:type="spellEnd"/>
-      <w:r>
-        <w:rPr>
-          <w:rFonts w:eastAsia="Times New Roman"/>
+        <w:t xml:space="preserve"> </w:t>
+      </w:r>
+      <w:proofErr w:type="spellStart"/>
+      <w:proofErr w:type="gramStart"/>
+      <w:r>
+        <w:rPr>
           <w:i/>
           <w:iCs/>
           <w:sz w:val="20"/>
           <w:szCs w:val="20"/>
-          <w:lang w:val="en-US"/>
-        </w:rPr>
-        <w:t>;</w:t>
-      </w:r>
-      <w:proofErr w:type="gramEnd"/>
-      <w:r>
-        <w:rPr>
-          <w:rFonts w:eastAsia="Times New Roman"/>
+        </w:rPr>
+        <w:t>Science</w:t>
+      </w:r>
+      <w:proofErr w:type="spellEnd"/>
+      <w:r>
+        <w:rPr>
           <w:i/>
           <w:iCs/>
           <w:sz w:val="20"/>
           <w:szCs w:val="20"/>
-          <w:lang w:val="en-US"/>
-        </w:rPr>
-        <w:t xml:space="preserve"> </w:t>
-      </w:r>
-      <w:r>
-        <w:rPr>
-          <w:rFonts w:eastAsia="Times New Roman"/>
+        </w:rPr>
+        <w:t>;</w:t>
+      </w:r>
+      <w:proofErr w:type="gramEnd"/>
+      <w:r>
+        <w:rPr>
           <w:i/>
           <w:iCs/>
           <w:sz w:val="20"/>
           <w:szCs w:val="20"/>
-          <w:lang w:val="en-US"/>
-        </w:rPr>
-        <w:t xml:space="preserve">Journal of Cognitive </w:t>
-      </w:r>
-      <w:proofErr w:type="gramStart"/>
-      <w:r>
-        <w:rPr>
-          <w:rFonts w:eastAsia="Times New Roman"/>
+        </w:rPr>
+        <w:t xml:space="preserve"> </w:t>
+      </w:r>
+      <w:r>
+        <w:rPr>
           <w:i/>
           <w:iCs/>
           <w:sz w:val="20"/>
           <w:szCs w:val="20"/>
-          <w:lang w:val="en-US"/>
-        </w:rPr>
-        <w:t>Psychology</w:t>
-      </w:r>
-      <w:r>
-        <w:rPr>
-          <w:rFonts w:eastAsia="Times New Roman"/>
+        </w:rPr>
+        <w:t xml:space="preserve">Child </w:t>
+      </w:r>
+      <w:proofErr w:type="gramStart"/>
+      <w:r>
+        <w:rPr>
           <w:i/>
           <w:iCs/>
           <w:sz w:val="20"/>
           <w:szCs w:val="20"/>
-          <w:lang w:val="en-US"/>
-        </w:rPr>
-        <w:t>;</w:t>
+        </w:rPr>
+        <w:t>Development;</w:t>
       </w:r>
       <w:proofErr w:type="gramEnd"/>
       <w:r>
         <w:rPr>
-          <w:rFonts w:eastAsia="Times New Roman"/>
           <w:i/>
           <w:iCs/>
           <w:sz w:val="20"/>
           <w:szCs w:val="20"/>
-          <w:lang w:val="en-US"/>
         </w:rPr>
         <w:t xml:space="preserve"> </w:t>
       </w:r>
@@ -5846,9 +6273,8 @@
           <w:sz w:val="20"/>
           <w:szCs w:val="20"/>
         </w:rPr>
-        <w:t xml:space="preserve">; </w:t>
-      </w:r>
-      <w:proofErr w:type="spellStart"/>
+        <w:t>;</w:t>
+      </w:r>
       <w:r>
         <w:rPr>
           <w:i/>
@@ -5856,9 +6282,8 @@
           <w:sz w:val="20"/>
           <w:szCs w:val="20"/>
         </w:rPr>
-        <w:t>Spatial</w:t>
-      </w:r>
-      <w:proofErr w:type="spellEnd"/>
+        <w:t xml:space="preserve"> </w:t>
+      </w:r>
       <w:r>
         <w:rPr>
           <w:i/>
@@ -5866,9 +6291,10 @@
           <w:sz w:val="20"/>
           <w:szCs w:val="20"/>
         </w:rPr>
-        <w:t xml:space="preserve"> </w:t>
-      </w:r>
-      <w:proofErr w:type="spellStart"/>
+        <w:t xml:space="preserve">PLOS </w:t>
+      </w:r>
+      <w:proofErr w:type="spellStart"/>
+      <w:proofErr w:type="gramStart"/>
       <w:r>
         <w:rPr>
           <w:i/>
@@ -5876,7 +6302,7 @@
           <w:sz w:val="20"/>
           <w:szCs w:val="20"/>
         </w:rPr>
-        <w:t>Cognition</w:t>
+        <w:t>One</w:t>
       </w:r>
       <w:proofErr w:type="spellEnd"/>
       <w:r>
@@ -5886,9 +6312,9 @@
           <w:sz w:val="20"/>
           <w:szCs w:val="20"/>
         </w:rPr>
-        <w:t xml:space="preserve"> </w:t>
-      </w:r>
-      <w:proofErr w:type="spellStart"/>
+        <w:t>;</w:t>
+      </w:r>
+      <w:proofErr w:type="gramEnd"/>
       <w:r>
         <w:rPr>
           <w:i/>
@@ -5896,9 +6322,10 @@
           <w:sz w:val="20"/>
           <w:szCs w:val="20"/>
         </w:rPr>
-        <w:t>and</w:t>
-      </w:r>
-      <w:proofErr w:type="spellEnd"/>
+        <w:t xml:space="preserve"> </w:t>
+      </w:r>
+      <w:proofErr w:type="spellStart"/>
+      <w:proofErr w:type="gramStart"/>
       <w:r>
         <w:rPr>
           <w:i/>
@@ -5906,9 +6333,9 @@
           <w:sz w:val="20"/>
           <w:szCs w:val="20"/>
         </w:rPr>
-        <w:t xml:space="preserve"> </w:t>
-      </w:r>
-      <w:proofErr w:type="spellStart"/>
+        <w:t>Gesture</w:t>
+      </w:r>
+      <w:proofErr w:type="spellEnd"/>
       <w:r>
         <w:rPr>
           <w:i/>
@@ -5916,9 +6343,9 @@
           <w:sz w:val="20"/>
           <w:szCs w:val="20"/>
         </w:rPr>
-        <w:t>Computation</w:t>
-      </w:r>
-      <w:proofErr w:type="spellEnd"/>
+        <w:t>;</w:t>
+      </w:r>
+      <w:proofErr w:type="gramEnd"/>
       <w:r>
         <w:rPr>
           <w:i/>
@@ -5926,7 +6353,7 @@
           <w:sz w:val="20"/>
           <w:szCs w:val="20"/>
         </w:rPr>
-        <w:t xml:space="preserve">: An </w:t>
+        <w:t xml:space="preserve"> </w:t>
       </w:r>
       <w:proofErr w:type="spellStart"/>
       <w:r>
@@ -5936,7 +6363,7 @@
           <w:sz w:val="20"/>
           <w:szCs w:val="20"/>
         </w:rPr>
-        <w:t>Interdisciplinary</w:t>
+        <w:t>Journal</w:t>
       </w:r>
       <w:proofErr w:type="spellEnd"/>
       <w:r>
@@ -5946,7 +6373,7 @@
           <w:sz w:val="20"/>
           <w:szCs w:val="20"/>
         </w:rPr>
-        <w:t xml:space="preserve"> </w:t>
+        <w:t xml:space="preserve"> of </w:t>
       </w:r>
       <w:proofErr w:type="spellStart"/>
       <w:r>
@@ -5956,7 +6383,7 @@
           <w:sz w:val="20"/>
           <w:szCs w:val="20"/>
         </w:rPr>
-        <w:t>Journal</w:t>
+        <w:t>Cognitive</w:t>
       </w:r>
       <w:proofErr w:type="spellEnd"/>
       <w:r>
@@ -5966,8 +6393,10 @@
           <w:sz w:val="20"/>
           <w:szCs w:val="20"/>
         </w:rPr>
-        <w:t xml:space="preserve">; </w:t>
-      </w:r>
+        <w:t xml:space="preserve"> </w:t>
+      </w:r>
+      <w:proofErr w:type="spellStart"/>
+      <w:proofErr w:type="gramStart"/>
       <w:r>
         <w:rPr>
           <w:i/>
@@ -5975,67 +6404,77 @@
           <w:sz w:val="20"/>
           <w:szCs w:val="20"/>
         </w:rPr>
-        <w:t>PLOS</w:t>
-      </w:r>
-      <w:r>
-        <w:rPr>
+        <w:t>Neuroscience</w:t>
+      </w:r>
+      <w:proofErr w:type="spellEnd"/>
+      <w:r>
+        <w:rPr>
+          <w:rFonts w:eastAsia="Times New Roman"/>
           <w:i/>
           <w:iCs/>
           <w:sz w:val="20"/>
           <w:szCs w:val="20"/>
-        </w:rPr>
-        <w:t xml:space="preserve"> </w:t>
-      </w:r>
-      <w:proofErr w:type="spellStart"/>
-      <w:proofErr w:type="gramStart"/>
-      <w:r>
-        <w:rPr>
+          <w:lang w:val="en-US"/>
+        </w:rPr>
+        <w:t>;</w:t>
+      </w:r>
+      <w:proofErr w:type="gramEnd"/>
+      <w:r>
+        <w:rPr>
+          <w:rFonts w:eastAsia="Times New Roman"/>
           <w:i/>
           <w:iCs/>
           <w:sz w:val="20"/>
           <w:szCs w:val="20"/>
-        </w:rPr>
-        <w:t>One</w:t>
-      </w:r>
-      <w:proofErr w:type="spellEnd"/>
-      <w:r>
-        <w:rPr>
+          <w:lang w:val="en-US"/>
+        </w:rPr>
+        <w:t xml:space="preserve"> </w:t>
+      </w:r>
+      <w:r>
+        <w:rPr>
+          <w:rFonts w:eastAsia="Times New Roman"/>
           <w:i/>
           <w:iCs/>
           <w:sz w:val="20"/>
           <w:szCs w:val="20"/>
-        </w:rPr>
-        <w:t>;</w:t>
-      </w:r>
-      <w:proofErr w:type="gramEnd"/>
-      <w:r>
-        <w:rPr>
+          <w:lang w:val="en-US"/>
+        </w:rPr>
+        <w:t xml:space="preserve">Journal of Cognitive </w:t>
+      </w:r>
+      <w:proofErr w:type="gramStart"/>
+      <w:r>
+        <w:rPr>
+          <w:rFonts w:eastAsia="Times New Roman"/>
           <w:i/>
           <w:iCs/>
           <w:sz w:val="20"/>
           <w:szCs w:val="20"/>
-        </w:rPr>
-        <w:t xml:space="preserve"> </w:t>
-      </w:r>
-      <w:proofErr w:type="spellStart"/>
-      <w:r>
-        <w:rPr>
+          <w:lang w:val="en-US"/>
+        </w:rPr>
+        <w:t>Psychology</w:t>
+      </w:r>
+      <w:r>
+        <w:rPr>
+          <w:rFonts w:eastAsia="Times New Roman"/>
           <w:i/>
           <w:iCs/>
           <w:sz w:val="20"/>
           <w:szCs w:val="20"/>
-        </w:rPr>
-        <w:t>Journal</w:t>
-      </w:r>
-      <w:proofErr w:type="spellEnd"/>
-      <w:r>
-        <w:rPr>
+          <w:lang w:val="en-US"/>
+        </w:rPr>
+        <w:t>;</w:t>
+      </w:r>
+      <w:proofErr w:type="gramEnd"/>
+      <w:r>
+        <w:rPr>
+          <w:rFonts w:eastAsia="Times New Roman"/>
           <w:i/>
           <w:iCs/>
           <w:sz w:val="20"/>
           <w:szCs w:val="20"/>
-        </w:rPr>
-        <w:t xml:space="preserve"> of </w:t>
+          <w:lang w:val="en-US"/>
+        </w:rPr>
+        <w:t xml:space="preserve"> </w:t>
       </w:r>
       <w:proofErr w:type="spellStart"/>
       <w:r>
@@ -6045,7 +6484,7 @@
           <w:sz w:val="20"/>
           <w:szCs w:val="20"/>
         </w:rPr>
-        <w:t>Experimental</w:t>
+        <w:t>Spatial</w:t>
       </w:r>
       <w:proofErr w:type="spellEnd"/>
       <w:r>
@@ -6065,7 +6504,7 @@
           <w:sz w:val="20"/>
           <w:szCs w:val="20"/>
         </w:rPr>
-        <w:t>Psychology</w:t>
+        <w:t>Cognition</w:t>
       </w:r>
       <w:proofErr w:type="spellEnd"/>
       <w:r>
@@ -6075,8 +6514,79 @@
           <w:sz w:val="20"/>
           <w:szCs w:val="20"/>
         </w:rPr>
-        <w:t>: General</w:t>
-      </w:r>
+        <w:t xml:space="preserve"> </w:t>
+      </w:r>
+      <w:proofErr w:type="spellStart"/>
+      <w:r>
+        <w:rPr>
+          <w:i/>
+          <w:iCs/>
+          <w:sz w:val="20"/>
+          <w:szCs w:val="20"/>
+        </w:rPr>
+        <w:t>and</w:t>
+      </w:r>
+      <w:proofErr w:type="spellEnd"/>
+      <w:r>
+        <w:rPr>
+          <w:i/>
+          <w:iCs/>
+          <w:sz w:val="20"/>
+          <w:szCs w:val="20"/>
+        </w:rPr>
+        <w:t xml:space="preserve"> </w:t>
+      </w:r>
+      <w:proofErr w:type="spellStart"/>
+      <w:r>
+        <w:rPr>
+          <w:i/>
+          <w:iCs/>
+          <w:sz w:val="20"/>
+          <w:szCs w:val="20"/>
+        </w:rPr>
+        <w:t>Computation</w:t>
+      </w:r>
+      <w:proofErr w:type="spellEnd"/>
+      <w:r>
+        <w:rPr>
+          <w:i/>
+          <w:iCs/>
+          <w:sz w:val="20"/>
+          <w:szCs w:val="20"/>
+        </w:rPr>
+        <w:t xml:space="preserve">: An </w:t>
+      </w:r>
+      <w:proofErr w:type="spellStart"/>
+      <w:r>
+        <w:rPr>
+          <w:i/>
+          <w:iCs/>
+          <w:sz w:val="20"/>
+          <w:szCs w:val="20"/>
+        </w:rPr>
+        <w:t>Interdisciplinary</w:t>
+      </w:r>
+      <w:proofErr w:type="spellEnd"/>
+      <w:r>
+        <w:rPr>
+          <w:i/>
+          <w:iCs/>
+          <w:sz w:val="20"/>
+          <w:szCs w:val="20"/>
+        </w:rPr>
+        <w:t xml:space="preserve"> </w:t>
+      </w:r>
+      <w:proofErr w:type="spellStart"/>
+      <w:r>
+        <w:rPr>
+          <w:i/>
+          <w:iCs/>
+          <w:sz w:val="20"/>
+          <w:szCs w:val="20"/>
+        </w:rPr>
+        <w:t>Journal</w:t>
+      </w:r>
+      <w:proofErr w:type="spellEnd"/>
     </w:p>
     <w:p>
       <w:pPr>
@@ -11696,6 +12206,7 @@
   <w:style w:type="character" w:default="1" w:styleId="DefaultParagraphFont">
     <w:name w:val="Default Paragraph Font"/>
     <w:uiPriority w:val="1"/>
+    <w:semiHidden/>
     <w:unhideWhenUsed/>
   </w:style>
   <w:style w:type="table" w:default="1" w:styleId="TableNormal">

</xml_diff>